<commit_message>
Correct the AHRQ grant entry from R-01 to R18 HS029474
The 2024 AHRQ award (Mazur/Marks, UNC Chapel Hill) is R18 HS029474,
"Development and Assessment of Artificial Intelligence (AI)-Enhanced
Pre-treatment Peer-review Process to Improve Patient Safety in Radiation
Oncology", 04/2024-03/2027, $1,345,650 total, per NIH RePORTER and AHRQ.
The CV and NIH biosketch had listed it as an R-01 under a different AHRQ
announcement title.

- CV Grants and Fellowships: date column 2024 - 2027, verified number,
  mechanism, title, period and total; Brian's role description kept
- NIH biosketch Honors/Awards/Grants: same correction
- CV PDF re-exported from Word (11 pages, unchanged)
- NSF synergistic activities draft item 5 and its README/build script
  updated to R18; PDF re-exported and still one page
- NSF guide updated to record the correction

Co-Authored-By: Claude Fable 5.1 <noreply@anthropic.com>
</commit_message>
<xml_diff>
--- a/Biosketch_BMA.docx
+++ b/Biosketch_BMA.docx
@@ -1577,9 +1577,9 @@
         <w:keepLines/>
       </w:pPr>
       <w:r>
-        <w:t>2024</w:t>
+        <w:t>2024 – 2027</w:t>
         <w:tab/>
-        <w:t>R-01, Co-Investigator: AHRQ Health Services Research Projects, University of North Carolina, Chapel Hill</w:t>
+        <w:t>R18 HS029474, Co-Investigator: AHRQ, Development and Assessment of Artificial Intelligence (AI)-Enhanced Pre-treatment Peer-review Process to Improve Patient Safety in Radiation Oncology, University of North Carolina, Chapel Hill</w:t>
       </w:r>
       <w:r/>
       <w:r/>

</xml_diff>

<commit_message>
Correct CV and biosketch citations to their published Crossref records
CV (PDF re-exported with Word):
- Open RT Structures: add Zuhour R; 03/2024 issue date; reorder below
  the 06/2024 TG-263U1 survey
- DicomRTTool paper: published title; 05/2021
- DICOM Attribute Manipulation Tool: "SOP Instance UID"
- COVER-ALL: "randomised phase 2 trial"; Shah K. Y.
- Colorectal liver mets segmentation: Frontiers in Oncology
- Elective pelvic nodes: add Dooley J; "Elective Pelvic Nodal Volumes";
  09/2026
- Book chapter: published title, eds Wang Y and Qi X.S, IOP Publishing,
  pp. 9-1-9-31, DOI, 11/2025
- Major Contributions: TG-263 membership 2021-Present (still a member)

Biosketch: same COVER-ALL and DicomRTTool corrections.

Co-Authored-By: Claude Opus 5.5 <noreply@anthropic.com>
</commit_message>
<xml_diff>
--- a/Biosketch_BMA.docx
+++ b/Biosketch_BMA.docx
@@ -2420,7 +2420,7 @@
           <w:bCs/>
           <w:color w:val="000000" w:themeColor="text1"/>
         </w:rPr>
-        <w:t xml:space="preserve">, O’Connor C.S, Rigaud B., Briones-Dimayuga M., Jones A.K., Fellman B.M, Huang S.Y., Kuban J., Metwalli Z. A., Sheth R., Habibollahi P., Patel M., Shan K. Y., Cox V. L., Kang HS. C., Morris V. K, Kopetz S., Javle M.M., Kaseb A., Tzeng CW., Cao HT., Newhook T., Chun Y. S., Vauthey JN., Gupta S., Paolucci I., Brock K.K. </w:t>
+        <w:t xml:space="preserve">, O’Connor C.S, Rigaud B., Briones-Dimayuga M., Jones A.K., Fellman B.M, Huang S.Y., Kuban J., Metwalli Z. A., Sheth R., Habibollahi P., Patel M., Shah K. Y., Cox V. L., Kang HS. C., Morris V. K, Kopetz S., Javle M.M., Kaseb A., Tzeng CW., Cao HT., Newhook T., Chun Y. S., Vauthey JN., Gupta S., Paolucci I., Brock K.K. </w:t>
       </w:r>
       <w:r>
         <w:rPr>
@@ -2430,7 +2430,7 @@
           <w:iCs/>
           <w:color w:val="000000" w:themeColor="text1"/>
         </w:rPr>
-        <w:t xml:space="preserve">Software-based versus visual assessment of the minimal ablative margin in patients with liver tumours undergoing percutaneous thermal ablation (COVER-ALL): a randomised controlled phase 2 trial.</w:t>
+        <w:t>Software-based versus visual assessment of the minimal ablative margin in patients with liver tumours undergoing percutaneous thermal ablation (COVER-ALL): a randomised phase 2 trial.</w:t>
       </w:r>
       <w:r>
         <w:rPr>
@@ -2539,14 +2539,14 @@
           <w:i/>
           <w:color w:val="000000" w:themeColor="text1"/>
         </w:rPr>
-        <w:t>Simple Python Module for Dicom and RT: Conversions to Images and Masks, and Predictions to Dicom-RT Structures</w:t>
+        <w:t>Simple Python Module for Conversions Between DICOM Images and Radiation Therapy Structures, Masks, and Prediction Arrays.</w:t>
       </w:r>
       <w:r>
         <w:rPr>
           <w:rFonts w:cs="Arial"/>
           <w:color w:val="000000" w:themeColor="text1"/>
         </w:rPr>
-        <w:t xml:space="preserve"> Practical Radiation Oncology 02/2021</w:t>
+        <w:t xml:space="preserve"> Practical Radiation Oncology 05/2021</w:t>
       </w:r>
     </w:p>
     <w:p>

</xml_diff>